<commit_message>
Docs 01-07 v3.1 and user manual v1.1: updated to the system as built
</commit_message>
<xml_diff>
--- a/docs/02_Business_Requirements_Document_College_Institution_Management_System.docx
+++ b/docs/02_Business_Requirements_Document_College_Institution_Management_System.docx
@@ -397,7 +397,7 @@
                 <w:sz w:val="18"/>
                 <w:szCs w:val="18"/>
               </w:rPr>
-              <w:t xml:space="preserve">Version 3.0 — updated to the system as built, for stakeholder review</w:t>
+              <w:t xml:space="preserve">Version 3.1 — updated to the system as built after the October 2026 completion batches, for stakeholder review</w:t>
             </w:r>
           </w:p>
         </w:tc>
@@ -1359,6 +1359,143 @@
                 <w:szCs w:val="18"/>
               </w:rPr>
               <w:t xml:space="preserve">Updated to the system as built (development build, October 2026): what is built, what is partly built and what remains, with corrected technology, data model and plan. The version 2.0 requirements stay the baseline.</w:t>
+            </w:r>
+          </w:p>
+        </w:tc>
+      </w:tr>
+      <w:tr>
+        <w:trPr>
+          <w:cantSplit/>
+        </w:trPr>
+        <w:tc>
+          <w:tcPr>
+            <w:tcW w:type="dxa" w:w="1083"/>
+            <w:tcBorders>
+              <w:top w:val="single" w:color="BFC9D6" w:sz="4"/>
+              <w:left w:val="single" w:color="BFC9D6" w:sz="4"/>
+              <w:bottom w:val="single" w:color="BFC9D6" w:sz="4"/>
+              <w:right w:val="single" w:color="BFC9D6" w:sz="4"/>
+            </w:tcBorders>
+            <w:shd w:fill="EEF3F8" w:color="auto" w:val="clear"/>
+            <w:tcMar>
+              <w:top w:type="dxa" w:w="60"/>
+              <w:left w:type="dxa" w:w="100"/>
+              <w:bottom w:type="dxa" w:w="60"/>
+              <w:right w:type="dxa" w:w="100"/>
+            </w:tcMar>
+            <w:vAlign w:val="center"/>
+          </w:tcPr>
+          <w:p>
+            <w:pPr>
+              <w:spacing w:after="30" w:before="30"/>
+              <w:jc w:val="left"/>
+            </w:pPr>
+            <w:r>
+              <w:rPr>
+                <w:rFonts w:ascii="Calibri" w:cs="Calibri" w:eastAsia="Calibri" w:hAnsi="Calibri"/>
+                <w:sz w:val="18"/>
+                <w:szCs w:val="18"/>
+              </w:rPr>
+              <w:t xml:space="preserve">3.1</w:t>
+            </w:r>
+          </w:p>
+        </w:tc>
+        <w:tc>
+          <w:tcPr>
+            <w:tcW w:type="dxa" w:w="1624"/>
+            <w:tcBorders>
+              <w:top w:val="single" w:color="BFC9D6" w:sz="4"/>
+              <w:left w:val="single" w:color="BFC9D6" w:sz="4"/>
+              <w:bottom w:val="single" w:color="BFC9D6" w:sz="4"/>
+              <w:right w:val="single" w:color="BFC9D6" w:sz="4"/>
+            </w:tcBorders>
+            <w:shd w:fill="EEF3F8" w:color="auto" w:val="clear"/>
+            <w:tcMar>
+              <w:top w:type="dxa" w:w="60"/>
+              <w:left w:type="dxa" w:w="100"/>
+              <w:bottom w:type="dxa" w:w="60"/>
+              <w:right w:type="dxa" w:w="100"/>
+            </w:tcMar>
+            <w:vAlign w:val="center"/>
+          </w:tcPr>
+          <w:p>
+            <w:pPr>
+              <w:spacing w:after="30" w:before="30"/>
+              <w:jc w:val="left"/>
+            </w:pPr>
+            <w:r>
+              <w:rPr>
+                <w:rFonts w:ascii="Calibri" w:cs="Calibri" w:eastAsia="Calibri" w:hAnsi="Calibri"/>
+                <w:sz w:val="18"/>
+                <w:szCs w:val="18"/>
+              </w:rPr>
+              <w:t xml:space="preserve">October 2026</w:t>
+            </w:r>
+          </w:p>
+        </w:tc>
+        <w:tc>
+          <w:tcPr>
+            <w:tcW w:type="dxa" w:w="1985"/>
+            <w:tcBorders>
+              <w:top w:val="single" w:color="BFC9D6" w:sz="4"/>
+              <w:left w:val="single" w:color="BFC9D6" w:sz="4"/>
+              <w:bottom w:val="single" w:color="BFC9D6" w:sz="4"/>
+              <w:right w:val="single" w:color="BFC9D6" w:sz="4"/>
+            </w:tcBorders>
+            <w:shd w:fill="EEF3F8" w:color="auto" w:val="clear"/>
+            <w:tcMar>
+              <w:top w:type="dxa" w:w="60"/>
+              <w:left w:type="dxa" w:w="100"/>
+              <w:bottom w:type="dxa" w:w="60"/>
+              <w:right w:type="dxa" w:w="100"/>
+            </w:tcMar>
+            <w:vAlign w:val="center"/>
+          </w:tcPr>
+          <w:p>
+            <w:pPr>
+              <w:spacing w:after="30" w:before="30"/>
+              <w:jc w:val="left"/>
+            </w:pPr>
+            <w:r>
+              <w:rPr>
+                <w:rFonts w:ascii="Calibri" w:cs="Calibri" w:eastAsia="Calibri" w:hAnsi="Calibri"/>
+                <w:sz w:val="18"/>
+                <w:szCs w:val="18"/>
+              </w:rPr>
+              <w:t xml:space="preserve">Msingi Technologies Ltd</w:t>
+            </w:r>
+          </w:p>
+        </w:tc>
+        <w:tc>
+          <w:tcPr>
+            <w:tcW w:type="dxa" w:w="4334"/>
+            <w:tcBorders>
+              <w:top w:val="single" w:color="BFC9D6" w:sz="4"/>
+              <w:left w:val="single" w:color="BFC9D6" w:sz="4"/>
+              <w:bottom w:val="single" w:color="BFC9D6" w:sz="4"/>
+              <w:right w:val="single" w:color="BFC9D6" w:sz="4"/>
+            </w:tcBorders>
+            <w:shd w:fill="EEF3F8" w:color="auto" w:val="clear"/>
+            <w:tcMar>
+              <w:top w:type="dxa" w:w="60"/>
+              <w:left w:type="dxa" w:w="100"/>
+              <w:bottom w:type="dxa" w:w="60"/>
+              <w:right w:type="dxa" w:w="100"/>
+            </w:tcMar>
+            <w:vAlign w:val="center"/>
+          </w:tcPr>
+          <w:p>
+            <w:pPr>
+              <w:spacing w:after="30" w:before="30"/>
+              <w:jc w:val="left"/>
+            </w:pPr>
+            <w:r>
+              <w:rPr>
+                <w:rFonts w:ascii="Calibri" w:cs="Calibri" w:eastAsia="Calibri" w:hAnsi="Calibri"/>
+                <w:sz w:val="18"/>
+                <w:szCs w:val="18"/>
+              </w:rPr>
+              <w:t xml:space="preserve">Implementation status brought up to date after the completion batches (campuses and transfers; instalments, penalties and discounts; email; two-step sign-in, API clients and personal-data requests; data import and document uploads; configurable approval stages; alumni and tracer surveys; live government adapters, deployment and load tests; the staff back-office in Kiswahili). The version 2.0 requirements stay the baseline.</w:t>
             </w:r>
           </w:p>
         </w:tc>
@@ -15321,49 +15458,7 @@
         <w:rPr>
           <w:rFonts w:ascii="Calibri" w:cs="Calibri" w:eastAsia="Calibri" w:hAnsi="Calibri"/>
         </w:rPr>
-        <w:t xml:space="preserve">The requirements above remain the baseline. This table records, for version 3.0, how far the system as built meets each one. </w:t>
-      </w:r>
-      <w:r>
-        <w:rPr>
-          <w:rFonts w:ascii="Calibri" w:cs="Calibri" w:eastAsia="Calibri" w:hAnsi="Calibri"/>
-          <w:b/>
-          <w:bCs/>
-        </w:rPr>
-        <w:t xml:space="preserve">Built</w:t>
-      </w:r>
-      <w:r>
-        <w:rPr>
-          <w:rFonts w:ascii="Calibri" w:cs="Calibri" w:eastAsia="Calibri" w:hAnsi="Calibri"/>
-        </w:rPr>
-        <w:t xml:space="preserve">: in the system and covered by automated tests. </w:t>
-      </w:r>
-      <w:r>
-        <w:rPr>
-          <w:rFonts w:ascii="Calibri" w:cs="Calibri" w:eastAsia="Calibri" w:hAnsi="Calibri"/>
-          <w:b/>
-          <w:bCs/>
-        </w:rPr>
-        <w:t xml:space="preserve">Partly built</w:t>
-      </w:r>
-      <w:r>
-        <w:rPr>
-          <w:rFonts w:ascii="Calibri" w:cs="Calibri" w:eastAsia="Calibri" w:hAnsi="Calibri"/>
-        </w:rPr>
-        <w:t xml:space="preserve">: usable, with the gap stated. </w:t>
-      </w:r>
-      <w:r>
-        <w:rPr>
-          <w:rFonts w:ascii="Calibri" w:cs="Calibri" w:eastAsia="Calibri" w:hAnsi="Calibri"/>
-          <w:b/>
-          <w:bCs/>
-        </w:rPr>
-        <w:t xml:space="preserve">Not yet built</w:t>
-      </w:r>
-      <w:r>
-        <w:rPr>
-          <w:rFonts w:ascii="Calibri" w:cs="Calibri" w:eastAsia="Calibri" w:hAnsi="Calibri"/>
-        </w:rPr>
-        <w:t xml:space="preserve">: planned, not in the system.</w:t>
+        <w:t xml:space="preserve">The requirements above remain the baseline. This table records, for version 3.1, how far the system as built meets each one. Built: in the system and covered by automated tests. Partly built: usable, with the gap stated. Not yet built: planned, not in the system. Where a requirement depends on an outside body (GePG, NACTVET, HESLB, NIDA, MUSE, TAMISEMI), the adapter is built and tested against a simulator of that body; the live connection is switched on when the body grants access.</w:t>
       </w:r>
     </w:p>
     <w:tbl>
@@ -16017,7 +16112,7 @@
                 <w:sz w:val="16"/>
                 <w:szCs w:val="16"/>
               </w:rPr>
-              <w:t xml:space="preserve">GePG control number for the application fee; the application can be submitted only after payment. GePG is simulated until live access is granted.</w:t>
+              <w:t xml:space="preserve">GePG control number for the application fee; the application can be submitted only after payment. The live GePG adapter is built and switched on with the institution's GePG certificates; until then GePG is simulated.</w:t>
             </w:r>
           </w:p>
         </w:tc>
@@ -16297,7 +16392,7 @@
                 <w:sz w:val="16"/>
                 <w:szCs w:val="16"/>
               </w:rPr>
-              <w:t xml:space="preserve">Not yet built</w:t>
+              <w:t xml:space="preserve">Built</w:t>
             </w:r>
           </w:p>
         </w:tc>
@@ -16329,7 +16424,7 @@
                 <w:sz w:val="16"/>
                 <w:szCs w:val="16"/>
               </w:rPr>
-              <w:t xml:space="preserve">Import of externally selected students (e.g. TAMISEMI).</w:t>
+              <w:t xml:space="preserve">Students selected by TAMISEMI or another body are imported from a file or fetched from TAMISEMI into the admission window as selected; their NECTA results are fetched, they go to NACTVET verification and receive offers like other applicants, and are told by SMS to sign up. Every import is checked row by row and applied only after someone other than the uploader signs it off.</w:t>
             </w:r>
           </w:p>
         </w:tc>
@@ -16820,7 +16915,7 @@
                 <w:sz w:val="16"/>
                 <w:szCs w:val="16"/>
               </w:rPr>
-              <w:t xml:space="preserve">Not yet built</w:t>
+              <w:t xml:space="preserve">Built</w:t>
             </w:r>
           </w:p>
         </w:tc>
@@ -16853,7 +16948,7 @@
                 <w:sz w:val="16"/>
                 <w:szCs w:val="16"/>
               </w:rPr>
-              <w:t xml:space="preserve">Multiple campuses and programme transfers.</w:t>
+              <w:t xml:space="preserve">Campuses (one main campus) and faculties; programmes offered per campus; programme and campus transfers asked by Registry or by the student, recommended by the receiving Head of Department and decided by the Deputy Principal (Academic).</w:t>
             </w:r>
           </w:p>
         </w:tc>
@@ -17271,7 +17366,7 @@
                 <w:sz w:val="16"/>
                 <w:szCs w:val="16"/>
               </w:rPr>
-              <w:t xml:space="preserve">Head of Department → Department Board (optional) → Academic Committee → Governing Board, then the database refuses changes. The stages are fixed in the software rather than configured per institution.</w:t>
+              <w:t xml:space="preserve">Head of Department → Department Board (optional) → Academic Committee → Governing Board, then the database refuses changes. Each institution sets the approval stages for module results and class result sheets (up to six), each able to return with comments.</w:t>
             </w:r>
           </w:p>
         </w:tc>
@@ -17480,7 +17575,7 @@
                 <w:sz w:val="16"/>
                 <w:szCs w:val="16"/>
               </w:rPr>
-              <w:t xml:space="preserve">Publication to the student portal with SMS is built. NACTVET results files are produced in an indicative layout until NACTVET's template is confirmed.</w:t>
+              <w:t xml:space="preserve">Publication to the student portal with SMS is built. Results go to NACTVET by API (or as a file); the live endpoint and the confirmed template are switched on when NACTVET issues its interface.</w:t>
             </w:r>
           </w:p>
         </w:tc>
@@ -17760,7 +17855,7 @@
                 <w:sz w:val="16"/>
                 <w:szCs w:val="16"/>
               </w:rPr>
-              <w:t xml:space="preserve">Partly built</w:t>
+              <w:t xml:space="preserve">Built</w:t>
             </w:r>
           </w:p>
         </w:tc>
@@ -17792,7 +17887,7 @@
                 <w:sz w:val="16"/>
                 <w:szCs w:val="16"/>
               </w:rPr>
-              <w:t xml:space="preserve">Fee items with GFS codes; fee structures per programme, year of study and academic year with local and foreign amounts and instalments. Intake and student category are not separate dimensions yet.</w:t>
+              <w:t xml:space="preserve">Fee items with GFS codes; fee structures per programme, year of study, academic year, intake and student category (e.g. regular, evening, weekend, distance) with local and foreign amounts and instalments.</w:t>
             </w:r>
           </w:p>
         </w:tc>
@@ -17898,7 +17993,7 @@
                 <w:sz w:val="16"/>
                 <w:szCs w:val="16"/>
               </w:rPr>
-              <w:t xml:space="preserve">Itemised invoices, control numbers, payment notifications, allocation, receipts and balances without manual matching (GePG simulated until live access).</w:t>
+              <w:t xml:space="preserve">Itemised invoices, control numbers, payment notifications, allocation, receipts and balances without manual matching. The live GePG adapter (signed XML: bills, control numbers by callback, payments and reconciliation) is built; it is switched on with the institution's GePG certificates.</w:t>
             </w:r>
           </w:p>
         </w:tc>
@@ -17969,7 +18064,7 @@
                 <w:sz w:val="16"/>
                 <w:szCs w:val="16"/>
               </w:rPr>
-              <w:t xml:space="preserve">Partly built</w:t>
+              <w:t xml:space="preserve">Built</w:t>
             </w:r>
           </w:p>
         </w:tc>
@@ -18001,7 +18096,7 @@
                 <w:sz w:val="16"/>
                 <w:szCs w:val="16"/>
               </w:rPr>
-              <w:t xml:space="preserve">Sponsors (including HESLB as a sponsor), waivers as credit notes, refunds with vouchers and two-level approval are built; instalments are part of fee structures. Penalties, discounts and instalment reminders are not.</w:t>
+              <w:t xml:space="preserve">Sponsors (including HESLB), waivers as credit notes, refunds with vouchers and two-level approval; instalment due dates with SMS reminders before, on and after the day; late-payment penalties once per instalment after a grace period; discount and scholarship schemes granted through the waiver approval.</w:t>
             </w:r>
           </w:p>
         </w:tc>
@@ -18074,7 +18169,7 @@
                 <w:sz w:val="16"/>
                 <w:szCs w:val="16"/>
               </w:rPr>
-              <w:t xml:space="preserve">Partly built</w:t>
+              <w:t xml:space="preserve">Built</w:t>
             </w:r>
           </w:p>
         </w:tc>
@@ -18107,7 +18202,7 @@
                 <w:sz w:val="16"/>
                 <w:szCs w:val="16"/>
               </w:rPr>
-              <w:t xml:space="preserve">Daily GePG reconciliation with exceptions and monthly sign-off is built; bank statement reconciliation is not.</w:t>
+              <w:t xml:space="preserve">Daily reconciliation with exceptions and monthly sign-off: GePG files or GePG's reconciliation request, and mobile money, collector and bank statements for institutions outside GePG.</w:t>
             </w:r>
           </w:p>
         </w:tc>
@@ -18283,7 +18378,7 @@
                 <w:sz w:val="16"/>
                 <w:szCs w:val="16"/>
               </w:rPr>
-              <w:t xml:space="preserve">Partly built</w:t>
+              <w:t xml:space="preserve">Built</w:t>
             </w:r>
           </w:p>
         </w:tc>
@@ -18316,7 +18411,7 @@
                 <w:sz w:val="16"/>
                 <w:szCs w:val="16"/>
               </w:rPr>
-              <w:t xml:space="preserve">A postings file (CSV) for any date range; a MUSE interface is not built.</w:t>
+              <w:t xml:space="preserve">Postings to MUSE per period by GFS code, each period posted once (simulated until the Treasury grants access), and a postings file (CSV) for any date range.</w:t>
             </w:r>
           </w:p>
         </w:tc>
@@ -18701,7 +18796,7 @@
                 <w:sz w:val="16"/>
                 <w:szCs w:val="16"/>
               </w:rPr>
-              <w:t xml:space="preserve">Not yet built</w:t>
+              <w:t xml:space="preserve">Built</w:t>
             </w:r>
           </w:p>
         </w:tc>
@@ -18734,7 +18829,7 @@
                 <w:sz w:val="16"/>
                 <w:szCs w:val="16"/>
               </w:rPr>
-              <w:t xml:space="preserve">Alumni contacts and tracer surveys.</w:t>
+              <w:t xml:space="preserve">Alumni records for graduates; tracer surveys sent by SMS link, with answers updating the alumni record and a summary of employment outcomes.</w:t>
             </w:r>
           </w:p>
         </w:tc>
@@ -18910,7 +19005,7 @@
                 <w:sz w:val="16"/>
                 <w:szCs w:val="16"/>
               </w:rPr>
-              <w:t xml:space="preserve">Partly built</w:t>
+              <w:t xml:space="preserve">Built</w:t>
             </w:r>
           </w:p>
         </w:tc>
@@ -18943,7 +19038,7 @@
                 <w:sz w:val="16"/>
                 <w:szCs w:val="16"/>
               </w:rPr>
-              <w:t xml:space="preserve">SMS for 44 events and bulk messages, and in-app notices, in English and Kiswahili; email is not built.</w:t>
+              <w:t xml:space="preserve">SMS and email for event messages, bulk SMS, and in-app notices, in English and Kiswahili; admission letters emailed with the PDF; reports emailed to staff on a schedule; confirmed email addresses for applicants, students and staff.</w:t>
             </w:r>
           </w:p>
         </w:tc>
@@ -19223,7 +19318,7 @@
                 <w:sz w:val="16"/>
                 <w:szCs w:val="16"/>
               </w:rPr>
-              <w:t xml:space="preserve">Partly built</w:t>
+              <w:t xml:space="preserve">Built</w:t>
             </w:r>
           </w:p>
         </w:tc>
@@ -19255,7 +19350,7 @@
                 <w:sz w:val="16"/>
                 <w:szCs w:val="16"/>
               </w:rPr>
-              <w:t xml:space="preserve">Roles with department, programme, hostel, sponsor and IPT scopes are built; multi-factor authentication is not.</w:t>
+              <w:t xml:space="preserve">Roles with department, programme, hostel, sponsor and IPT scopes; two-step sign-in with an authenticator app (SMS code as a fall-back) required for the roles the administrator chooses. Campus-level scopes are not yet added.</w:t>
             </w:r>
           </w:p>
         </w:tc>
@@ -19432,7 +19527,7 @@
                 <w:sz w:val="16"/>
                 <w:szCs w:val="16"/>
               </w:rPr>
-              <w:t xml:space="preserve">Partly built</w:t>
+              <w:t xml:space="preserve">Built</w:t>
             </w:r>
           </w:p>
         </w:tc>
@@ -19464,7 +19559,7 @@
                 <w:sz w:val="16"/>
                 <w:szCs w:val="16"/>
               </w:rPr>
-              <w:t xml:space="preserve">Consent to the privacy notice is recorded at sign-up with the notice version and time; role-based access, personal data hidden from management views and masked in logs, exports recorded. Retention periods and data subject request handling are not built.</w:t>
+              <w:t xml:space="preserve">Consent recorded with the notice version and time; role-based access, personal data hidden from management views and masked in logs, exports recorded; everyone can download their data and send a request (copy, correction, erasure, objection) answered within 30 days; retention periods with a preview and a monthly job. National identification numbers are encrypted.</w:t>
             </w:r>
           </w:p>
         </w:tc>
@@ -19537,7 +19632,7 @@
                 <w:sz w:val="16"/>
                 <w:szCs w:val="16"/>
               </w:rPr>
-              <w:t xml:space="preserve">Not yet built</w:t>
+              <w:t xml:space="preserve">Built</w:t>
             </w:r>
           </w:p>
         </w:tc>
@@ -19570,7 +19665,7 @@
                 <w:sz w:val="16"/>
                 <w:szCs w:val="16"/>
               </w:rPr>
-              <w:t xml:space="preserve">Data migration tools with validation reports.</w:t>
+              <w:t xml:space="preserve">Import of students, earlier results, opening balances and external selections from CSV or Excel templates, checked row by row with a validation report and applied only after a second person signs off.</w:t>
             </w:r>
           </w:p>
         </w:tc>
@@ -19641,7 +19736,7 @@
                 <w:sz w:val="16"/>
                 <w:szCs w:val="16"/>
               </w:rPr>
-              <w:t xml:space="preserve">Partly built</w:t>
+              <w:t xml:space="preserve">Built</w:t>
             </w:r>
           </w:p>
         </w:tc>
@@ -19673,7 +19768,7 @@
                 <w:sz w:val="16"/>
                 <w:szCs w:val="16"/>
               </w:rPr>
-              <w:t xml:space="preserve">The admission and student portals are in English and Kiswahili; the staff back-office is in English.</w:t>
+              <w:t xml:space="preserve">The admission and student portals and the staff back-office are in English and Kiswahili; each person's choice is kept with their account.</w:t>
             </w:r>
           </w:p>
         </w:tc>
@@ -19746,7 +19841,7 @@
                 <w:sz w:val="16"/>
                 <w:szCs w:val="16"/>
               </w:rPr>
-              <w:t xml:space="preserve">Partly built</w:t>
+              <w:t xml:space="preserve">Built</w:t>
             </w:r>
           </w:p>
         </w:tc>
@@ -19779,7 +19874,7 @@
                 <w:sz w:val="16"/>
                 <w:szCs w:val="16"/>
               </w:rPr>
-              <w:t xml:space="preserve">The REST API is documented (OpenAPI); approved third-party access (OAuth2 clients) is not built.</w:t>
+              <w:t xml:space="preserve">The REST API is documented (OpenAPI); connected systems use OAuth2 client credentials with scopes on a read-only integration API (programmes, students, results, payments); a client can be switched off at once.</w:t>
             </w:r>
           </w:p>
         </w:tc>
@@ -19850,7 +19945,7 @@
                 <w:sz w:val="16"/>
                 <w:szCs w:val="16"/>
               </w:rPr>
-              <w:t xml:space="preserve">Not yet built</w:t>
+              <w:t xml:space="preserve">Partly built</w:t>
             </w:r>
           </w:p>
         </w:tc>
@@ -19882,7 +19977,7 @@
                 <w:sz w:val="16"/>
                 <w:szCs w:val="16"/>
               </w:rPr>
-              <w:t xml:space="preserve">Production hosting, monitoring and the support desk are set up at go-live (Document 07).</w:t>
+              <w:t xml:space="preserve">The production stack is ready: Docker Compose with a TLS proxy, WAL archiving and encrypted backups with a tested restore, health and metrics endpoints, continuous integration and load tests (100 users: no errors, p95 37 ms). Hosting, monitoring dashboards and the support desk are set up at go-live (Document 07).</w:t>
             </w:r>
           </w:p>
         </w:tc>
@@ -19902,49 +19997,7 @@
         <w:rPr>
           <w:rFonts w:ascii="Calibri" w:cs="Calibri" w:eastAsia="Calibri" w:hAnsi="Calibri"/>
         </w:rPr>
-        <w:t xml:space="preserve">In total </w:t>
-      </w:r>
-      <w:r>
-        <w:rPr>
-          <w:rFonts w:ascii="Calibri" w:cs="Calibri" w:eastAsia="Calibri" w:hAnsi="Calibri"/>
-          <w:b/>
-          <w:bCs/>
-        </w:rPr>
-        <w:t xml:space="preserve">27</w:t>
-      </w:r>
-      <w:r>
-        <w:rPr>
-          <w:rFonts w:ascii="Calibri" w:cs="Calibri" w:eastAsia="Calibri" w:hAnsi="Calibri"/>
-        </w:rPr>
-        <w:t xml:space="preserve"> requirements are built, </w:t>
-      </w:r>
-      <w:r>
-        <w:rPr>
-          <w:rFonts w:ascii="Calibri" w:cs="Calibri" w:eastAsia="Calibri" w:hAnsi="Calibri"/>
-          <w:b/>
-          <w:bCs/>
-        </w:rPr>
-        <w:t xml:space="preserve">10</w:t>
-      </w:r>
-      <w:r>
-        <w:rPr>
-          <w:rFonts w:ascii="Calibri" w:cs="Calibri" w:eastAsia="Calibri" w:hAnsi="Calibri"/>
-        </w:rPr>
-        <w:t xml:space="preserve"> partly built and </w:t>
-      </w:r>
-      <w:r>
-        <w:rPr>
-          <w:rFonts w:ascii="Calibri" w:cs="Calibri" w:eastAsia="Calibri" w:hAnsi="Calibri"/>
-          <w:b/>
-          <w:bCs/>
-        </w:rPr>
-        <w:t xml:space="preserve">5</w:t>
-      </w:r>
-      <w:r>
-        <w:rPr>
-          <w:rFonts w:ascii="Calibri" w:cs="Calibri" w:eastAsia="Calibri" w:hAnsi="Calibri"/>
-        </w:rPr>
-        <w:t xml:space="preserve"> not yet built. Most gaps depend on outside access (live GePG, NACTVET and SMS connections) or are planned for the pilot phase (multi-factor authentication, migration tools, email).</w:t>
+        <w:t xml:space="preserve">In total 40 requirements are built and 2 partly built. The two partly built depend on outside bodies or on go-live: NACTVET's live results interface (BR-19) and production hosting with the support desk (BR-42). Live connections to GePG, NACTVET, HESLB, NIDA, MUSE and TAMISEMI are built and tested against simulators and are switched on when each body grants access.</w:t>
       </w:r>
     </w:p>
     <w:p>
@@ -22804,7 +22857,7 @@
                 <w:sz w:val="16"/>
                 <w:szCs w:val="16"/>
               </w:rPr>
-              <w:t xml:space="preserve">Student and applicant payments use GePG control numbers; sponsor bank remittances are recorded by the bursary; no cash receipts.</w:t>
+              <w:t xml:space="preserve">Student and applicant payments use GePG control numbers (or, outside GePG, the institution's payment reference with its listed mobile money and bank accounts); sponsor remittances are recorded by the bursary; no cash receipts.</w:t>
             </w:r>
           </w:p>
         </w:tc>
@@ -23236,7 +23289,7 @@
                 <w:sz w:val="16"/>
                 <w:szCs w:val="16"/>
               </w:rPr>
-              <w:t xml:space="preserve">Roles and scopes are checked on every request and PostgreSQL row-level security separates institutions. Campus and class scopes wait for campuses.</w:t>
+              <w:t xml:space="preserve">Roles and scopes are checked on every request and PostgreSQL row-level security separates institutions. Campus and class scopes are not yet added.</w:t>
             </w:r>
           </w:p>
         </w:tc>
@@ -23307,7 +23360,7 @@
                 <w:sz w:val="16"/>
                 <w:szCs w:val="16"/>
               </w:rPr>
-              <w:t xml:space="preserve">Not yet built: retention periods and anonymisation of non-admitted applicants.</w:t>
+              <w:t xml:space="preserve">Retention periods for applicant data and for messages (default 24 months), with a preview of what would go; a monthly job anonymises applicants who never joined once their period has passed; students' academic and financial records are kept.</w:t>
             </w:r>
           </w:p>
         </w:tc>

</xml_diff>

<commit_message>
Timetabling: venues, class and exam timetables with clash checks, publishing, personal timetables; modules from curricula; Docker actions on Node 24; docs
</commit_message>
<xml_diff>
--- a/docs/02_Business_Requirements_Document_College_Institution_Management_System.docx
+++ b/docs/02_Business_Requirements_Document_College_Institution_Management_System.docx
@@ -397,7 +397,7 @@
                 <w:sz w:val="18"/>
                 <w:szCs w:val="18"/>
               </w:rPr>
-              <w:t xml:space="preserve">Version 3.1 — updated to the system as built after the October 2026 completion batches, for stakeholder review</w:t>
+              <w:t xml:space="preserve">Version 3.2 — updated to the system as built after the October 2026 completion batches, for stakeholder review</w:t>
             </w:r>
           </w:p>
         </w:tc>
@@ -1511,6 +1511,143 @@
                 <w:szCs w:val="18"/>
               </w:rPr>
               <w:t xml:space="preserve">Implementation status brought up to date after the completion batches (campuses and transfers; instalments, penalties and discounts; email; two-step sign-in, API clients and personal-data requests; data import and document uploads; configurable approval stages; alumni and tracer surveys; live government adapters, deployment and load tests; the staff back-office in Kiswahili). The version 2.0 requirements stay the baseline. Abbreviations and glossary table added (section 1.3).</w:t>
+            </w:r>
+          </w:p>
+        </w:tc>
+      </w:tr>
+      <w:tr>
+        <w:trPr>
+          <w:cantSplit/>
+        </w:trPr>
+        <w:tc>
+          <w:tcPr>
+            <w:tcW w:type="dxa" w:w="1083"/>
+            <w:tcBorders>
+              <w:top w:val="single" w:color="BFC9D6" w:sz="4"/>
+              <w:left w:val="single" w:color="BFC9D6" w:sz="4"/>
+              <w:bottom w:val="single" w:color="BFC9D6" w:sz="4"/>
+              <w:right w:val="single" w:color="BFC9D6" w:sz="4"/>
+            </w:tcBorders>
+            <w:shd w:fill="EEF3F8" w:color="auto" w:val="clear"/>
+            <w:tcMar>
+              <w:top w:type="dxa" w:w="60"/>
+              <w:left w:type="dxa" w:w="100"/>
+              <w:bottom w:type="dxa" w:w="60"/>
+              <w:right w:type="dxa" w:w="100"/>
+            </w:tcMar>
+            <w:vAlign w:val="center"/>
+          </w:tcPr>
+          <w:p>
+            <w:pPr>
+              <w:spacing w:after="30" w:before="30"/>
+              <w:jc w:val="left"/>
+            </w:pPr>
+            <w:r>
+              <w:rPr>
+                <w:rFonts w:ascii="Calibri" w:cs="Calibri" w:eastAsia="Calibri" w:hAnsi="Calibri"/>
+                <w:sz w:val="18"/>
+                <w:szCs w:val="18"/>
+              </w:rPr>
+              <w:t xml:space="preserve">3.2</w:t>
+            </w:r>
+          </w:p>
+        </w:tc>
+        <w:tc>
+          <w:tcPr>
+            <w:tcW w:type="dxa" w:w="1624"/>
+            <w:tcBorders>
+              <w:top w:val="single" w:color="BFC9D6" w:sz="4"/>
+              <w:left w:val="single" w:color="BFC9D6" w:sz="4"/>
+              <w:bottom w:val="single" w:color="BFC9D6" w:sz="4"/>
+              <w:right w:val="single" w:color="BFC9D6" w:sz="4"/>
+            </w:tcBorders>
+            <w:shd w:fill="EEF3F8" w:color="auto" w:val="clear"/>
+            <w:tcMar>
+              <w:top w:type="dxa" w:w="60"/>
+              <w:left w:type="dxa" w:w="100"/>
+              <w:bottom w:type="dxa" w:w="60"/>
+              <w:right w:type="dxa" w:w="100"/>
+            </w:tcMar>
+            <w:vAlign w:val="center"/>
+          </w:tcPr>
+          <w:p>
+            <w:pPr>
+              <w:spacing w:after="30" w:before="30"/>
+              <w:jc w:val="left"/>
+            </w:pPr>
+            <w:r>
+              <w:rPr>
+                <w:rFonts w:ascii="Calibri" w:cs="Calibri" w:eastAsia="Calibri" w:hAnsi="Calibri"/>
+                <w:sz w:val="18"/>
+                <w:szCs w:val="18"/>
+              </w:rPr>
+              <w:t xml:space="preserve">October 2026</w:t>
+            </w:r>
+          </w:p>
+        </w:tc>
+        <w:tc>
+          <w:tcPr>
+            <w:tcW w:type="dxa" w:w="1985"/>
+            <w:tcBorders>
+              <w:top w:val="single" w:color="BFC9D6" w:sz="4"/>
+              <w:left w:val="single" w:color="BFC9D6" w:sz="4"/>
+              <w:bottom w:val="single" w:color="BFC9D6" w:sz="4"/>
+              <w:right w:val="single" w:color="BFC9D6" w:sz="4"/>
+            </w:tcBorders>
+            <w:shd w:fill="EEF3F8" w:color="auto" w:val="clear"/>
+            <w:tcMar>
+              <w:top w:type="dxa" w:w="60"/>
+              <w:left w:type="dxa" w:w="100"/>
+              <w:bottom w:type="dxa" w:w="60"/>
+              <w:right w:type="dxa" w:w="100"/>
+            </w:tcMar>
+            <w:vAlign w:val="center"/>
+          </w:tcPr>
+          <w:p>
+            <w:pPr>
+              <w:spacing w:after="30" w:before="30"/>
+              <w:jc w:val="left"/>
+            </w:pPr>
+            <w:r>
+              <w:rPr>
+                <w:rFonts w:ascii="Calibri" w:cs="Calibri" w:eastAsia="Calibri" w:hAnsi="Calibri"/>
+                <w:sz w:val="18"/>
+                <w:szCs w:val="18"/>
+              </w:rPr>
+              <w:t xml:space="preserve">Msingi Technologies Ltd</w:t>
+            </w:r>
+          </w:p>
+        </w:tc>
+        <w:tc>
+          <w:tcPr>
+            <w:tcW w:type="dxa" w:w="4334"/>
+            <w:tcBorders>
+              <w:top w:val="single" w:color="BFC9D6" w:sz="4"/>
+              <w:left w:val="single" w:color="BFC9D6" w:sz="4"/>
+              <w:bottom w:val="single" w:color="BFC9D6" w:sz="4"/>
+              <w:right w:val="single" w:color="BFC9D6" w:sz="4"/>
+            </w:tcBorders>
+            <w:shd w:fill="EEF3F8" w:color="auto" w:val="clear"/>
+            <w:tcMar>
+              <w:top w:type="dxa" w:w="60"/>
+              <w:left w:type="dxa" w:w="100"/>
+              <w:bottom w:type="dxa" w:w="60"/>
+              <w:right w:type="dxa" w:w="100"/>
+            </w:tcMar>
+            <w:vAlign w:val="center"/>
+          </w:tcPr>
+          <w:p>
+            <w:pPr>
+              <w:spacing w:after="30" w:before="30"/>
+              <w:jc w:val="left"/>
+            </w:pPr>
+            <w:r>
+              <w:rPr>
+                <w:rFonts w:ascii="Calibri" w:cs="Calibri" w:eastAsia="Calibri" w:hAnsi="Calibri"/>
+                <w:sz w:val="18"/>
+                <w:szCs w:val="18"/>
+              </w:rPr>
+              <w:t xml:space="preserve">BR-43 added and the as-built status updated after Batch 11: timetabling. Teaching venues, the weekly class timetable with clash checks, the examination timetable with venues and invigilators, publishing to students (with SMS), and personal timetables for lecturers and students.</w:t>
             </w:r>
           </w:p>
         </w:tc>
@@ -5655,6 +5792,75 @@
                 <w:szCs w:val="18"/>
               </w:rPr>
               <w:t xml:space="preserve">Information and communication technology.</w:t>
+            </w:r>
+          </w:p>
+        </w:tc>
+      </w:tr>
+      <w:tr>
+        <w:trPr>
+          <w:cantSplit/>
+        </w:trPr>
+        <w:tc>
+          <w:tcPr>
+            <w:tcW w:type="dxa" w:w="1985"/>
+            <w:tcBorders>
+              <w:top w:val="single" w:color="BFC9D6" w:sz="4"/>
+              <w:left w:val="single" w:color="BFC9D6" w:sz="4"/>
+              <w:bottom w:val="single" w:color="BFC9D6" w:sz="4"/>
+              <w:right w:val="single" w:color="BFC9D6" w:sz="4"/>
+            </w:tcBorders>
+            <w:tcMar>
+              <w:top w:type="dxa" w:w="60"/>
+              <w:left w:type="dxa" w:w="100"/>
+              <w:bottom w:type="dxa" w:w="60"/>
+              <w:right w:type="dxa" w:w="100"/>
+            </w:tcMar>
+            <w:vAlign w:val="center"/>
+          </w:tcPr>
+          <w:p>
+            <w:pPr>
+              <w:spacing w:after="30" w:before="30"/>
+              <w:jc w:val="left"/>
+            </w:pPr>
+            <w:r>
+              <w:rPr>
+                <w:rFonts w:ascii="Calibri" w:cs="Calibri" w:eastAsia="Calibri" w:hAnsi="Calibri"/>
+                <w:sz w:val="18"/>
+                <w:szCs w:val="18"/>
+              </w:rPr>
+              <w:t xml:space="preserve">Invigilator</w:t>
+            </w:r>
+          </w:p>
+        </w:tc>
+        <w:tc>
+          <w:tcPr>
+            <w:tcW w:type="dxa" w:w="7041"/>
+            <w:tcBorders>
+              <w:top w:val="single" w:color="BFC9D6" w:sz="4"/>
+              <w:left w:val="single" w:color="BFC9D6" w:sz="4"/>
+              <w:bottom w:val="single" w:color="BFC9D6" w:sz="4"/>
+              <w:right w:val="single" w:color="BFC9D6" w:sz="4"/>
+            </w:tcBorders>
+            <w:tcMar>
+              <w:top w:type="dxa" w:w="60"/>
+              <w:left w:type="dxa" w:w="100"/>
+              <w:bottom w:type="dxa" w:w="60"/>
+              <w:right w:type="dxa" w:w="100"/>
+            </w:tcMar>
+            <w:vAlign w:val="center"/>
+          </w:tcPr>
+          <w:p>
+            <w:pPr>
+              <w:spacing w:after="30" w:before="30"/>
+              <w:jc w:val="left"/>
+            </w:pPr>
+            <w:r>
+              <w:rPr>
+                <w:rFonts w:ascii="Calibri" w:cs="Calibri" w:eastAsia="Calibri" w:hAnsi="Calibri"/>
+                <w:sz w:val="18"/>
+                <w:szCs w:val="18"/>
+              </w:rPr>
+              <w:t xml:space="preserve">A member of staff who supervises candidates during an examination paper.</w:t>
             </w:r>
           </w:p>
         </w:tc>
@@ -13873,6 +14079,176 @@
               <w:bottom w:val="single" w:color="BFC9D6" w:sz="4"/>
               <w:right w:val="single" w:color="BFC9D6" w:sz="4"/>
             </w:tcBorders>
+            <w:shd w:fill="EEF3F8" w:color="auto" w:val="clear"/>
+            <w:tcMar>
+              <w:top w:type="dxa" w:w="60"/>
+              <w:left w:type="dxa" w:w="100"/>
+              <w:bottom w:type="dxa" w:w="60"/>
+              <w:right w:type="dxa" w:w="100"/>
+            </w:tcMar>
+            <w:vAlign w:val="center"/>
+          </w:tcPr>
+          <w:p>
+            <w:pPr>
+              <w:spacing w:after="30" w:before="30"/>
+              <w:jc w:val="left"/>
+            </w:pPr>
+            <w:r>
+              <w:rPr>
+                <w:rFonts w:ascii="Calibri" w:cs="Calibri" w:eastAsia="Calibri" w:hAnsi="Calibri"/>
+                <w:sz w:val="17"/>
+                <w:szCs w:val="17"/>
+              </w:rPr>
+              <w:t xml:space="preserve">BR-43</w:t>
+            </w:r>
+          </w:p>
+        </w:tc>
+        <w:tc>
+          <w:tcPr>
+            <w:tcW w:type="dxa" w:w="5596"/>
+            <w:tcBorders>
+              <w:top w:val="single" w:color="BFC9D6" w:sz="4"/>
+              <w:left w:val="single" w:color="BFC9D6" w:sz="4"/>
+              <w:bottom w:val="single" w:color="BFC9D6" w:sz="4"/>
+              <w:right w:val="single" w:color="BFC9D6" w:sz="4"/>
+            </w:tcBorders>
+            <w:shd w:fill="EEF3F8" w:color="auto" w:val="clear"/>
+            <w:tcMar>
+              <w:top w:type="dxa" w:w="60"/>
+              <w:left w:type="dxa" w:w="100"/>
+              <w:bottom w:type="dxa" w:w="60"/>
+              <w:right w:type="dxa" w:w="100"/>
+            </w:tcMar>
+            <w:vAlign w:val="center"/>
+          </w:tcPr>
+          <w:p>
+            <w:pPr>
+              <w:spacing w:after="30" w:before="30"/>
+              <w:jc w:val="left"/>
+            </w:pPr>
+            <w:r>
+              <w:rPr>
+                <w:rFonts w:ascii="Calibri" w:cs="Calibri" w:eastAsia="Calibri" w:hAnsi="Calibri"/>
+                <w:sz w:val="17"/>
+                <w:szCs w:val="17"/>
+              </w:rPr>
+              <w:t xml:space="preserve">The system shall keep the class and examination timetables of each semester (venues, lecturers, invigilators), prevent clashes of rooms, staff and students, and publish each timetable to students.</w:t>
+            </w:r>
+          </w:p>
+        </w:tc>
+        <w:tc>
+          <w:tcPr>
+            <w:tcW w:type="dxa" w:w="631"/>
+            <w:tcBorders>
+              <w:top w:val="single" w:color="BFC9D6" w:sz="4"/>
+              <w:left w:val="single" w:color="BFC9D6" w:sz="4"/>
+              <w:bottom w:val="single" w:color="BFC9D6" w:sz="4"/>
+              <w:right w:val="single" w:color="BFC9D6" w:sz="4"/>
+            </w:tcBorders>
+            <w:shd w:fill="EEF3F8" w:color="auto" w:val="clear"/>
+            <w:tcMar>
+              <w:top w:type="dxa" w:w="60"/>
+              <w:left w:type="dxa" w:w="100"/>
+              <w:bottom w:type="dxa" w:w="60"/>
+              <w:right w:type="dxa" w:w="100"/>
+            </w:tcMar>
+            <w:vAlign w:val="center"/>
+          </w:tcPr>
+          <w:p>
+            <w:pPr>
+              <w:spacing w:after="30" w:before="30"/>
+              <w:jc w:val="left"/>
+            </w:pPr>
+            <w:r>
+              <w:rPr>
+                <w:rFonts w:ascii="Calibri" w:cs="Calibri" w:eastAsia="Calibri" w:hAnsi="Calibri"/>
+                <w:sz w:val="17"/>
+                <w:szCs w:val="17"/>
+              </w:rPr>
+              <w:t xml:space="preserve">S</w:t>
+            </w:r>
+          </w:p>
+        </w:tc>
+        <w:tc>
+          <w:tcPr>
+            <w:tcW w:type="dxa" w:w="812"/>
+            <w:tcBorders>
+              <w:top w:val="single" w:color="BFC9D6" w:sz="4"/>
+              <w:left w:val="single" w:color="BFC9D6" w:sz="4"/>
+              <w:bottom w:val="single" w:color="BFC9D6" w:sz="4"/>
+              <w:right w:val="single" w:color="BFC9D6" w:sz="4"/>
+            </w:tcBorders>
+            <w:shd w:fill="EEF3F8" w:color="auto" w:val="clear"/>
+            <w:tcMar>
+              <w:top w:type="dxa" w:w="60"/>
+              <w:left w:type="dxa" w:w="100"/>
+              <w:bottom w:type="dxa" w:w="60"/>
+              <w:right w:type="dxa" w:w="100"/>
+            </w:tcMar>
+            <w:vAlign w:val="center"/>
+          </w:tcPr>
+          <w:p>
+            <w:pPr>
+              <w:spacing w:after="30" w:before="30"/>
+              <w:jc w:val="left"/>
+            </w:pPr>
+            <w:r>
+              <w:rPr>
+                <w:rFonts w:ascii="Calibri" w:cs="Calibri" w:eastAsia="Calibri" w:hAnsi="Calibri"/>
+                <w:sz w:val="17"/>
+                <w:szCs w:val="17"/>
+              </w:rPr>
+              <w:t xml:space="preserve">O4</w:t>
+            </w:r>
+          </w:p>
+        </w:tc>
+        <w:tc>
+          <w:tcPr>
+            <w:tcW w:type="dxa" w:w="1085"/>
+            <w:tcBorders>
+              <w:top w:val="single" w:color="BFC9D6" w:sz="4"/>
+              <w:left w:val="single" w:color="BFC9D6" w:sz="4"/>
+              <w:bottom w:val="single" w:color="BFC9D6" w:sz="4"/>
+              <w:right w:val="single" w:color="BFC9D6" w:sz="4"/>
+            </w:tcBorders>
+            <w:shd w:fill="EEF3F8" w:color="auto" w:val="clear"/>
+            <w:tcMar>
+              <w:top w:type="dxa" w:w="60"/>
+              <w:left w:type="dxa" w:w="100"/>
+              <w:bottom w:type="dxa" w:w="60"/>
+              <w:right w:type="dxa" w:w="100"/>
+            </w:tcMar>
+            <w:vAlign w:val="center"/>
+          </w:tcPr>
+          <w:p>
+            <w:pPr>
+              <w:spacing w:after="30" w:before="30"/>
+              <w:jc w:val="left"/>
+            </w:pPr>
+            <w:r>
+              <w:rPr>
+                <w:rFonts w:ascii="Calibri" w:cs="Calibri" w:eastAsia="Calibri" w:hAnsi="Calibri"/>
+                <w:sz w:val="17"/>
+                <w:szCs w:val="17"/>
+              </w:rPr>
+              <w:t xml:space="preserve">R2</w:t>
+            </w:r>
+          </w:p>
+        </w:tc>
+      </w:tr>
+      <w:tr>
+        <w:trPr>
+          <w:cantSplit/>
+        </w:trPr>
+        <w:tc>
+          <w:tcPr>
+            <w:tcW w:type="dxa" w:w="902"/>
+            <w:tcBorders>
+              <w:top w:val="single" w:color="BFC9D6" w:sz="4"/>
+              <w:left w:val="single" w:color="BFC9D6" w:sz="4"/>
+              <w:bottom w:val="single" w:color="BFC9D6" w:sz="4"/>
+              <w:right w:val="single" w:color="BFC9D6" w:sz="4"/>
+            </w:tcBorders>
             <w:tcMar>
               <w:top w:type="dxa" w:w="60"/>
               <w:left w:type="dxa" w:w="100"/>
@@ -21079,6 +21455,112 @@
                 <w:szCs w:val="16"/>
               </w:rPr>
               <w:t xml:space="preserve">Attendance per session, percentage per student, SMS warning below the threshold (default 75%), used in examination eligibility.</w:t>
+            </w:r>
+          </w:p>
+        </w:tc>
+      </w:tr>
+      <w:tr>
+        <w:trPr>
+          <w:cantSplit/>
+        </w:trPr>
+        <w:tc>
+          <w:tcPr>
+            <w:tcW w:type="dxa" w:w="812"/>
+            <w:tcBorders>
+              <w:top w:val="single" w:color="BFC9D6" w:sz="4"/>
+              <w:left w:val="single" w:color="BFC9D6" w:sz="4"/>
+              <w:bottom w:val="single" w:color="BFC9D6" w:sz="4"/>
+              <w:right w:val="single" w:color="BFC9D6" w:sz="4"/>
+            </w:tcBorders>
+            <w:shd w:fill="EEF3F8" w:color="auto" w:val="clear"/>
+            <w:tcMar>
+              <w:top w:type="dxa" w:w="60"/>
+              <w:left w:type="dxa" w:w="100"/>
+              <w:bottom w:type="dxa" w:w="60"/>
+              <w:right w:type="dxa" w:w="100"/>
+            </w:tcMar>
+            <w:vAlign w:val="center"/>
+          </w:tcPr>
+          <w:p>
+            <w:pPr>
+              <w:spacing w:after="30" w:before="30"/>
+              <w:jc w:val="left"/>
+            </w:pPr>
+            <w:r>
+              <w:rPr>
+                <w:rFonts w:ascii="Calibri" w:cs="Calibri" w:eastAsia="Calibri" w:hAnsi="Calibri"/>
+                <w:b/>
+                <w:bCs/>
+                <w:sz w:val="16"/>
+                <w:szCs w:val="16"/>
+              </w:rPr>
+              <w:t xml:space="preserve">BR-43</w:t>
+            </w:r>
+          </w:p>
+        </w:tc>
+        <w:tc>
+          <w:tcPr>
+            <w:tcW w:type="dxa" w:w="1173"/>
+            <w:tcBorders>
+              <w:top w:val="single" w:color="BFC9D6" w:sz="4"/>
+              <w:left w:val="single" w:color="BFC9D6" w:sz="4"/>
+              <w:bottom w:val="single" w:color="BFC9D6" w:sz="4"/>
+              <w:right w:val="single" w:color="BFC9D6" w:sz="4"/>
+            </w:tcBorders>
+            <w:shd w:fill="EEF3F8" w:color="auto" w:val="clear"/>
+            <w:tcMar>
+              <w:top w:type="dxa" w:w="60"/>
+              <w:left w:type="dxa" w:w="100"/>
+              <w:bottom w:type="dxa" w:w="60"/>
+              <w:right w:type="dxa" w:w="100"/>
+            </w:tcMar>
+            <w:vAlign w:val="center"/>
+          </w:tcPr>
+          <w:p>
+            <w:pPr>
+              <w:spacing w:after="30" w:before="30"/>
+              <w:jc w:val="left"/>
+            </w:pPr>
+            <w:r>
+              <w:rPr>
+                <w:rFonts w:ascii="Calibri" w:cs="Calibri" w:eastAsia="Calibri" w:hAnsi="Calibri"/>
+                <w:sz w:val="16"/>
+                <w:szCs w:val="16"/>
+              </w:rPr>
+              <w:t xml:space="preserve">Built</w:t>
+            </w:r>
+          </w:p>
+        </w:tc>
+        <w:tc>
+          <w:tcPr>
+            <w:tcW w:type="dxa" w:w="7041"/>
+            <w:tcBorders>
+              <w:top w:val="single" w:color="BFC9D6" w:sz="4"/>
+              <w:left w:val="single" w:color="BFC9D6" w:sz="4"/>
+              <w:bottom w:val="single" w:color="BFC9D6" w:sz="4"/>
+              <w:right w:val="single" w:color="BFC9D6" w:sz="4"/>
+            </w:tcBorders>
+            <w:shd w:fill="EEF3F8" w:color="auto" w:val="clear"/>
+            <w:tcMar>
+              <w:top w:type="dxa" w:w="60"/>
+              <w:left w:type="dxa" w:w="100"/>
+              <w:bottom w:type="dxa" w:w="60"/>
+              <w:right w:type="dxa" w:w="100"/>
+            </w:tcMar>
+            <w:vAlign w:val="center"/>
+          </w:tcPr>
+          <w:p>
+            <w:pPr>
+              <w:spacing w:after="30" w:before="30"/>
+              <w:jc w:val="left"/>
+            </w:pPr>
+            <w:r>
+              <w:rPr>
+                <w:rFonts w:ascii="Calibri" w:cs="Calibri" w:eastAsia="Calibri" w:hAnsi="Calibri"/>
+                <w:sz w:val="16"/>
+                <w:szCs w:val="16"/>
+              </w:rPr>
+              <w:t xml:space="preserve">Weekly class timetable with venues and lecturers; examination timetable with venues and invigilators; room, lecturer and student clashes refused or shown; published to the student portal with SMS.</w:t>
             </w:r>
           </w:p>
         </w:tc>

</xml_diff>